<commit_message>
Unbold Harvard fellowship description in CV to match other entries
Co-Authored-By: Claude Opus 4.7 (1M context) <noreply@anthropic.com>
</commit_message>
<xml_diff>
--- a/Yifat Aran CV 2026 April 29.docx
+++ b/Yifat Aran CV 2026 April 29.docx
@@ -2194,7 +2194,15 @@
           <w:bCs/>
           <w:color w:val="000000" w:themeColor="text1"/>
         </w:rPr>
-        <w:t>2025–present Fellow, The Project on Israel and the Regional Economy, Harvard Business School</w:t>
+        <w:t>2025–present</w:t>
+      </w:r>
+      <w:r>
+        <w:rPr>
+          <w:rFonts w:ascii="Garamond" w:hAnsi="Garamond"/>
+          <w:color w:val="000000" w:themeColor="text1"/>
+        </w:rPr>
+        <w:tab/>
+        <w:t xml:space="preserve">Fellow, The Project on Israel and the Regional Economy, Harvard Business School</w:t>
       </w:r>
     </w:p>
     <w:p>

</xml_diff>

<commit_message>
Remove redundant 'Fellow,' and 'Fellowship,' role labels in CV
Co-Authored-By: Claude Opus 4.7 (1M context) <noreply@anthropic.com>
</commit_message>
<xml_diff>
--- a/Yifat Aran CV 2026 April 29.docx
+++ b/Yifat Aran CV 2026 April 29.docx
@@ -2202,7 +2202,7 @@
           <w:color w:val="000000" w:themeColor="text1"/>
         </w:rPr>
         <w:tab/>
-        <w:t xml:space="preserve">Fellow, The Project on Israel and the Regional Economy, Harvard Business School</w:t>
+        <w:t xml:space="preserve">The Project on Israel and the Regional Economy, Harvard Business School</w:t>
       </w:r>
     </w:p>
     <w:p>
@@ -2262,7 +2262,7 @@
           <w:color w:val="000000" w:themeColor="text1"/>
         </w:rPr>
         <w:tab/>
-        <w:t>Fellowship, Institute for the Study of Employee Ownership and Profit Sharing, Rutgers University</w:t>
+        <w:t>Institute for the Study of Employee Ownership and Profit Sharing, Rutgers University</w:t>
       </w:r>
     </w:p>
     <w:p>

</xml_diff>

<commit_message>
Update CEO Turnover in Dual-Class Firms to forthcoming in JLS 2026
Moves the paper from R&R / Working Papers status to Refereed Journals
in the CV and Peer-Reviewed Journals on the website. Also adds the
1-18 page range to Shared Capitalism in the CV.

Co-Authored-By: Claude Opus 4.7 (1M context) <noreply@anthropic.com>
</commit_message>
<xml_diff>
--- a/Yifat Aran CV 2026 April 29.docx
+++ b/Yifat Aran CV 2026 April 29.docx
@@ -1370,7 +1370,7 @@
           <w:rFonts w:ascii="Garamond" w:hAnsi="Garamond"/>
           <w:color w:val="000000" w:themeColor="text1"/>
         </w:rPr>
-        <w:t xml:space="preserve"> (</w:t>
+        <w:t xml:space="preserve">, </w:t>
       </w:r>
       <w:r>
         <w:rPr>
@@ -1386,14 +1386,14 @@
           <w:smallCaps/>
           <w:color w:val="000000" w:themeColor="text1"/>
         </w:rPr>
-        <w:t xml:space="preserve"> 2026</w:t>
-      </w:r>
-      <w:r>
-        <w:rPr>
-          <w:rFonts w:ascii="Garamond" w:hAnsi="Garamond"/>
-          <w:color w:val="000000" w:themeColor="text1"/>
-        </w:rPr>
-        <w:t xml:space="preserve">). </w:t>
+        <w:t xml:space="preserve"> 1–18</w:t>
+      </w:r>
+      <w:r>
+        <w:rPr>
+          <w:rFonts w:ascii="Garamond" w:hAnsi="Garamond"/>
+          <w:color w:val="000000" w:themeColor="text1"/>
+        </w:rPr>
+        <w:t xml:space="preserve"> (2026). </w:t>
       </w:r>
     </w:p>
     <w:p>
@@ -1432,6 +1432,67 @@
           <w:iCs/>
           <w:color w:val="000000" w:themeColor="text1"/>
         </w:rPr>
+        <w:t>CEO Turnover at Dual-Class Firms</w:t>
+      </w:r>
+      <w:r>
+        <w:rPr>
+          <w:rFonts w:ascii="Garamond" w:hAnsi="Garamond"/>
+          <w:color w:val="000000" w:themeColor="text1"/>
+        </w:rPr>
+        <w:t xml:space="preserve"> (forthcoming, </w:t>
+      </w:r>
+      <w:r>
+        <w:rPr>
+          <w:rFonts w:ascii="Garamond" w:hAnsi="Garamond"/>
+          <w:smallCaps/>
+          <w:color w:val="000000" w:themeColor="text1"/>
+        </w:rPr>
+        <w:t>Journal of Legal Studies</w:t>
+      </w:r>
+      <w:r>
+        <w:rPr>
+          <w:rFonts w:ascii="Garamond" w:hAnsi="Garamond"/>
+          <w:color w:val="000000" w:themeColor="text1"/>
+        </w:rPr>
+        <w:t xml:space="preserve"> 2026).</w:t>
+      </w:r>
+    </w:p>
+    <w:p>
+      <w:pPr>
+        <w:pStyle w:val="ListParagraph"/>
+        <w:numPr>
+          <w:ilvl w:val="0"/>
+          <w:numId w:val="2"/>
+        </w:numPr>
+        <w:spacing w:after="80"/>
+        <w:rPr>
+          <w:rFonts w:ascii="Garamond" w:hAnsi="Garamond"/>
+          <w:color w:val="000000" w:themeColor="text1"/>
+        </w:rPr>
+      </w:pPr>
+      <w:r>
+        <w:rPr>
+          <w:rFonts w:ascii="Garamond" w:hAnsi="Garamond"/>
+          <w:b/>
+          <w:bCs/>
+          <w:color w:val="000000" w:themeColor="text1"/>
+        </w:rPr>
+        <w:t>Yifat Aran</w:t>
+      </w:r>
+      <w:r>
+        <w:rPr>
+          <w:rFonts w:ascii="Garamond" w:hAnsi="Garamond"/>
+          <w:color w:val="000000" w:themeColor="text1"/>
+        </w:rPr>
+        <w:t xml:space="preserve">, Brian Broughman, and Elizabeth Pollman, </w:t>
+      </w:r>
+      <w:r>
+        <w:rPr>
+          <w:rFonts w:ascii="Garamond" w:hAnsi="Garamond"/>
+          <w:i/>
+          <w:iCs/>
+          <w:color w:val="000000" w:themeColor="text1"/>
+        </w:rPr>
         <w:t>Exit after Exit</w:t>
       </w:r>
       <w:r>
@@ -2058,104 +2119,6 @@
           <w:color w:val="000000" w:themeColor="text1"/>
         </w:rPr>
         <w:t>, ECGI Blog (April 27, 2026).</w:t>
-      </w:r>
-    </w:p>
-    <w:p>
-      <w:pPr>
-        <w:pStyle w:val="Heading2"/>
-        <w:rPr>
-          <w:rFonts w:ascii="Garamond" w:hAnsi="Garamond"/>
-          <w:color w:val="000000" w:themeColor="text1"/>
-        </w:rPr>
-      </w:pPr>
-      <w:r>
-        <w:rPr>
-          <w:rFonts w:ascii="Garamond" w:hAnsi="Garamond"/>
-          <w:color w:val="000000" w:themeColor="text1"/>
-        </w:rPr>
-        <w:t>Under Review / Revise &amp; Resubmit</w:t>
-      </w:r>
-    </w:p>
-    <w:p>
-      <w:pPr>
-        <w:pStyle w:val="ListParagraph"/>
-        <w:numPr>
-          <w:ilvl w:val="0"/>
-          <w:numId w:val="5"/>
-        </w:numPr>
-        <w:spacing w:after="80"/>
-        <w:rPr>
-          <w:rFonts w:ascii="Garamond" w:hAnsi="Garamond"/>
-          <w:color w:val="000000" w:themeColor="text1"/>
-        </w:rPr>
-      </w:pPr>
-      <w:r>
-        <w:rPr>
-          <w:rFonts w:ascii="Garamond" w:hAnsi="Garamond"/>
-          <w:b/>
-          <w:bCs/>
-          <w:color w:val="000000" w:themeColor="text1"/>
-        </w:rPr>
-        <w:t>Yifat Aran</w:t>
-      </w:r>
-      <w:r>
-        <w:rPr>
-          <w:rFonts w:ascii="Garamond" w:hAnsi="Garamond"/>
-          <w:color w:val="000000" w:themeColor="text1"/>
-        </w:rPr>
-        <w:t xml:space="preserve">, Brian Broughman, and Elizabeth Pollman, </w:t>
-      </w:r>
-      <w:r>
-        <w:rPr>
-          <w:rFonts w:ascii="Garamond" w:hAnsi="Garamond"/>
-          <w:i/>
-          <w:iCs/>
-          <w:color w:val="000000" w:themeColor="text1"/>
-        </w:rPr>
-        <w:t>CEO Turnover at Dual Class Firms</w:t>
-      </w:r>
-      <w:r>
-        <w:rPr>
-          <w:rFonts w:ascii="Garamond" w:hAnsi="Garamond"/>
-          <w:color w:val="000000" w:themeColor="text1"/>
-        </w:rPr>
-        <w:t xml:space="preserve"> (R&amp;R, </w:t>
-      </w:r>
-      <w:r>
-        <w:rPr>
-          <w:rFonts w:ascii="Garamond" w:hAnsi="Garamond"/>
-          <w:smallCaps/>
-          <w:color w:val="000000" w:themeColor="text1"/>
-        </w:rPr>
-        <w:t>The Journal of Legal Studies</w:t>
-      </w:r>
-      <w:r>
-        <w:rPr>
-          <w:rFonts w:ascii="Garamond" w:hAnsi="Garamond"/>
-          <w:color w:val="000000" w:themeColor="text1"/>
-        </w:rPr>
-        <w:t>).</w:t>
-      </w:r>
-      <w:r>
-        <w:rPr>
-          <w:rFonts w:ascii="Garamond" w:hAnsi="Garamond"/>
-          <w:color w:val="000000" w:themeColor="text1"/>
-        </w:rPr>
-        <w:br/>
-      </w:r>
-      <w:r>
-        <w:rPr>
-          <w:rFonts w:ascii="Garamond" w:hAnsi="Garamond"/>
-          <w:color w:val="000000" w:themeColor="text1"/>
-        </w:rPr>
-        <w:br/>
-      </w:r>
-      <w:r>
-        <w:rPr>
-          <w:rFonts w:ascii="Garamond" w:hAnsi="Garamond"/>
-          <w:color w:val="000000" w:themeColor="text1"/>
-        </w:rPr>
-        <w:br/>
       </w:r>
     </w:p>
     <w:p>

</xml_diff>

<commit_message>
Remove duplicate HBR article from refereed journals section in CV
Co-Authored-By: Claude Opus 4.7 (1M context) <noreply@anthropic.com>
</commit_message>
<xml_diff>
--- a/Yifat Aran CV 2026 April 29.docx
+++ b/Yifat Aran CV 2026 April 29.docx
@@ -951,67 +951,6 @@
           <w:szCs w:val="20"/>
         </w:rPr>
         <w:t>Cited by the Economic Division of the Tel Aviv District Court in CA 41875-01-20 Kaminski v. Ravid (2023), CA 29021-08-20 Tzur v. Empirical Hire (2023), and CA 17248-05-19 TechnoPlus Ventures v. Bioville (2023).</w:t>
-      </w:r>
-    </w:p>
-    <w:p>
-      <w:pPr>
-        <w:pStyle w:val="ListParagraph"/>
-        <w:numPr>
-          <w:ilvl w:val="0"/>
-          <w:numId w:val="2"/>
-        </w:numPr>
-        <w:spacing w:after="160" w:line="259" w:lineRule="auto"/>
-        <w:rPr>
-          <w:rFonts w:ascii="Garamond" w:eastAsiaTheme="majorEastAsia" w:hAnsi="Garamond" w:cstheme="majorBidi"/>
-        </w:rPr>
-      </w:pPr>
-      <w:r>
-        <w:rPr>
-          <w:rFonts w:ascii="Garamond" w:eastAsiaTheme="majorEastAsia" w:hAnsi="Garamond" w:cstheme="majorBidi"/>
-          <w:b/>
-          <w:bCs/>
-        </w:rPr>
-        <w:lastRenderedPageBreak/>
-        <w:t>Yifat Aran</w:t>
-      </w:r>
-      <w:r>
-        <w:rPr>
-          <w:rFonts w:ascii="Garamond" w:eastAsiaTheme="majorEastAsia" w:hAnsi="Garamond" w:cstheme="majorBidi"/>
-        </w:rPr>
-        <w:t xml:space="preserve"> &amp; Raviv </w:t>
-      </w:r>
-      <w:r>
-        <w:rPr>
-          <w:rFonts w:ascii="Garamond" w:hAnsi="Garamond" w:cstheme="majorBidi"/>
-        </w:rPr>
-        <w:t xml:space="preserve">Murciano-Goroff, </w:t>
-      </w:r>
-      <w:r>
-        <w:rPr>
-          <w:rFonts w:ascii="Garamond" w:hAnsi="Garamond" w:cstheme="majorBidi"/>
-          <w:i/>
-          <w:iCs/>
-        </w:rPr>
-        <w:t>When It Comes to Compensation, More Equity Isn’t Always Better</w:t>
-      </w:r>
-      <w:r>
-        <w:rPr>
-          <w:rFonts w:ascii="Garamond" w:hAnsi="Garamond" w:cstheme="majorBidi"/>
-        </w:rPr>
-        <w:t xml:space="preserve">, </w:t>
-      </w:r>
-      <w:r>
-        <w:rPr>
-          <w:rFonts w:ascii="Garamond" w:hAnsi="Garamond" w:cstheme="majorBidi"/>
-          <w:smallCaps/>
-        </w:rPr>
-        <w:t>Harvard Business Review</w:t>
-      </w:r>
-      <w:r>
-        <w:rPr>
-          <w:rFonts w:ascii="Garamond" w:hAnsi="Garamond" w:cstheme="majorBidi"/>
-        </w:rPr>
-        <w:t xml:space="preserve"> (September 12, 2023).</w:t>
       </w:r>
     </w:p>
     <w:p>

</xml_diff>

<commit_message>
Record awarded ISF grant for Liquidity Without Listing
The 2026-2029 ISF grant is no longer pending. In the CV, move it out of
the "Pending" subsection into the awarded Research Grants list with its
₪540,000 sum, and drop the now-empty "Pending" heading. Correct the
funder name to "Israel Science Foundation" in both ISF entries.

Add a Research Grants section to the site (none existed) listing all four
grants, and mirror it into llms.txt and llms-full.txt.

The CV also picks up previously uncommitted edits: the NPR Indicator
feature line and the Work in Progress section.

Co-Authored-By: Claude Opus 5 (1M context) <noreply@anthropic.com>
</commit_message>
<xml_diff>
--- a/Yifat Aran CV 2026 April 29.docx
+++ b/Yifat Aran CV 2026 April 29.docx
@@ -104,19 +104,9 @@
     </w:p>
     <w:p>
       <w:pPr>
-        <w:pBdr>
-          <w:bottom w:val="single" w:sz="2" w:space="0" w:color="2C3E50"/>
-        </w:pBdr>
-        <w:spacing w:before="60" w:after="60"/>
-        <w:rPr>
-          <w:rFonts w:ascii="Garamond" w:hAnsi="Garamond"/>
-          <w:color w:val="000000" w:themeColor="text1"/>
-        </w:rPr>
-      </w:pPr>
-    </w:p>
-    <w:p>
-      <w:pPr>
         <w:pStyle w:val="Heading1"/>
+        <w:keepNext/>
+        <w:keepLines/>
         <w:rPr>
           <w:rFonts w:ascii="Garamond" w:hAnsi="Garamond"/>
           <w:color w:val="000000" w:themeColor="text1"/>
@@ -320,6 +310,8 @@
     <w:p>
       <w:pPr>
         <w:pStyle w:val="Heading1"/>
+        <w:keepNext/>
+        <w:keepLines/>
         <w:rPr>
           <w:rFonts w:ascii="Garamond" w:hAnsi="Garamond"/>
           <w:color w:val="000000" w:themeColor="text1"/>
@@ -505,6 +497,8 @@
     <w:p>
       <w:pPr>
         <w:pStyle w:val="Heading1"/>
+        <w:keepNext/>
+        <w:keepLines/>
         <w:rPr>
           <w:rFonts w:ascii="Garamond" w:hAnsi="Garamond"/>
           <w:color w:val="000000" w:themeColor="text1"/>
@@ -645,6 +639,8 @@
     <w:p>
       <w:pPr>
         <w:pStyle w:val="Heading1"/>
+        <w:keepNext/>
+        <w:keepLines/>
         <w:rPr>
           <w:rFonts w:ascii="Garamond" w:hAnsi="Garamond"/>
           <w:color w:val="000000" w:themeColor="text1"/>
@@ -678,6 +674,8 @@
     <w:p>
       <w:pPr>
         <w:pStyle w:val="Heading1"/>
+        <w:keepNext/>
+        <w:keepLines/>
         <w:rPr>
           <w:rFonts w:ascii="Garamond" w:hAnsi="Garamond"/>
           <w:color w:val="000000" w:themeColor="text1"/>
@@ -694,6 +692,8 @@
     <w:p>
       <w:pPr>
         <w:pStyle w:val="Heading2"/>
+        <w:keepNext/>
+        <w:keepLines/>
         <w:rPr>
           <w:rFonts w:ascii="Garamond" w:hAnsi="Garamond"/>
           <w:color w:val="000000" w:themeColor="text1"/>
@@ -791,6 +791,27 @@
     </w:p>
     <w:p>
       <w:pPr>
+        <w:spacing w:after="120"/>
+        <w:ind w:left="720"/>
+        <w:rPr>
+          <w:rFonts w:ascii="Garamond" w:hAnsi="Garamond"/>
+          <w:color w:val="000000" w:themeColor="text1"/>
+        </w:rPr>
+      </w:pPr>
+      <w:r>
+        <w:rPr>
+          <w:rFonts w:ascii="Garamond" w:hAnsi="Garamond"/>
+          <w:i/>
+          <w:iCs/>
+          <w:color w:val="000000" w:themeColor="text1"/>
+          <w:sz w:val="20"/>
+          <w:szCs w:val="20"/>
+        </w:rPr>
+        <w:t xml:space="preserve">Featured on The Indicator from Planet Money (NPR), June 2026.</w:t>
+      </w:r>
+    </w:p>
+    <w:p>
+      <w:pPr>
         <w:pStyle w:val="ListParagraph"/>
         <w:numPr>
           <w:ilvl w:val="0"/>
@@ -1459,6 +1480,8 @@
     <w:p>
       <w:pPr>
         <w:pStyle w:val="Heading2"/>
+        <w:keepNext/>
+        <w:keepLines/>
         <w:rPr>
           <w:rFonts w:ascii="Garamond" w:hAnsi="Garamond"/>
           <w:color w:val="000000" w:themeColor="text1"/>
@@ -1618,6 +1641,130 @@
     <w:p>
       <w:pPr>
         <w:pStyle w:val="Heading2"/>
+        <w:keepNext/>
+        <w:keepLines/>
+        <w:rPr>
+          <w:rFonts w:ascii="Garamond" w:hAnsi="Garamond"/>
+          <w:color w:val="000000" w:themeColor="text1"/>
+        </w:rPr>
+      </w:pPr>
+      <w:r>
+        <w:rPr>
+          <w:rFonts w:ascii="Garamond" w:hAnsi="Garamond"/>
+          <w:color w:val="000000" w:themeColor="text1"/>
+        </w:rPr>
+        <w:t xml:space="preserve">Work in Progress</w:t>
+      </w:r>
+    </w:p>
+    <w:p>
+      <w:pPr>
+        <w:pStyle w:val="ListParagraph"/>
+        <w:numPr>
+          <w:ilvl w:val="0"/>
+          <w:numId w:val="10"/>
+        </w:numPr>
+        <w:spacing w:after="80"/>
+        <w:rPr>
+          <w:rFonts w:ascii="Garamond" w:hAnsi="Garamond"/>
+          <w:color w:val="000000" w:themeColor="text1"/>
+        </w:rPr>
+      </w:pPr>
+      <w:r>
+        <w:rPr>
+          <w:rFonts w:ascii="Garamond" w:hAnsi="Garamond"/>
+          <w:b/>
+          <w:bCs/>
+          <w:color w:val="000000" w:themeColor="text1"/>
+        </w:rPr>
+        <w:t xml:space="preserve">Yifat Aran</w:t>
+      </w:r>
+      <w:r>
+        <w:rPr>
+          <w:rFonts w:ascii="Garamond" w:hAnsi="Garamond"/>
+          <w:bCs/>
+          <w:color w:val="000000" w:themeColor="text1"/>
+        </w:rPr>
+        <w:t xml:space="preserve">, </w:t>
+      </w:r>
+      <w:r>
+        <w:rPr>
+          <w:rFonts w:ascii="Garamond" w:hAnsi="Garamond"/>
+          <w:bCs/>
+          <w:color w:val="000000" w:themeColor="text1"/>
+          <w:i/>
+        </w:rPr>
+        <w:t xml:space="preserve">The Optional Firm</w:t>
+      </w:r>
+      <w:r>
+        <w:rPr>
+          <w:rFonts w:ascii="Garamond" w:hAnsi="Garamond"/>
+          <w:bCs/>
+          <w:color w:val="000000" w:themeColor="text1"/>
+        </w:rPr>
+        <w:t xml:space="preserve">.</w:t>
+      </w:r>
+    </w:p>
+    <w:p>
+      <w:pPr>
+        <w:pStyle w:val="ListParagraph"/>
+        <w:numPr>
+          <w:ilvl w:val="0"/>
+          <w:numId w:val="10"/>
+        </w:numPr>
+        <w:spacing w:after="80"/>
+        <w:rPr>
+          <w:rFonts w:ascii="Garamond" w:hAnsi="Garamond"/>
+          <w:color w:val="000000" w:themeColor="text1"/>
+        </w:rPr>
+      </w:pPr>
+      <w:r>
+        <w:rPr>
+          <w:rFonts w:ascii="Garamond" w:hAnsi="Garamond"/>
+          <w:bCs/>
+          <w:color w:val="000000" w:themeColor="text1"/>
+        </w:rPr>
+        <w:t xml:space="preserve">Brian Broughman &amp; </w:t>
+      </w:r>
+      <w:r>
+        <w:rPr>
+          <w:rFonts w:ascii="Garamond" w:hAnsi="Garamond"/>
+          <w:b/>
+          <w:bCs/>
+          <w:color w:val="000000" w:themeColor="text1"/>
+        </w:rPr>
+        <w:t xml:space="preserve">Yifat Aran</w:t>
+      </w:r>
+      <w:r>
+        <w:rPr>
+          <w:rFonts w:ascii="Garamond" w:hAnsi="Garamond"/>
+          <w:bCs/>
+          <w:color w:val="000000" w:themeColor="text1"/>
+        </w:rPr>
+        <w:t xml:space="preserve">, </w:t>
+      </w:r>
+      <w:r>
+        <w:rPr>
+          <w:rFonts w:ascii="Garamond" w:hAnsi="Garamond"/>
+          <w:bCs/>
+          <w:color w:val="000000" w:themeColor="text1"/>
+          <w:i/>
+        </w:rPr>
+        <w:t xml:space="preserve">Venture Unraveled</w:t>
+      </w:r>
+      <w:r>
+        <w:rPr>
+          <w:rFonts w:ascii="Garamond" w:hAnsi="Garamond"/>
+          <w:bCs/>
+          <w:color w:val="000000" w:themeColor="text1"/>
+        </w:rPr>
+        <w:t xml:space="preserve">.</w:t>
+      </w:r>
+    </w:p>
+    <w:p>
+      <w:pPr>
+        <w:pStyle w:val="Heading2"/>
+        <w:keepNext/>
+        <w:keepLines/>
         <w:rPr>
           <w:rFonts w:ascii="Garamond" w:hAnsi="Garamond"/>
           <w:color w:val="000000" w:themeColor="text1"/>
@@ -2063,6 +2210,8 @@
     <w:p>
       <w:pPr>
         <w:pStyle w:val="Heading1"/>
+        <w:keepNext/>
+        <w:keepLines/>
         <w:rPr>
           <w:rFonts w:ascii="Garamond" w:hAnsi="Garamond"/>
           <w:color w:val="000000" w:themeColor="text1"/>
@@ -2260,6 +2409,8 @@
     <w:p>
       <w:pPr>
         <w:pStyle w:val="Heading1"/>
+        <w:keepNext/>
+        <w:keepLines/>
         <w:rPr>
           <w:rFonts w:ascii="Garamond" w:hAnsi="Garamond"/>
           <w:color w:val="000000" w:themeColor="text1"/>
@@ -2771,6 +2922,8 @@
     <w:p>
       <w:pPr>
         <w:pStyle w:val="Heading1"/>
+        <w:keepNext/>
+        <w:keepLines/>
         <w:rPr>
           <w:rFonts w:ascii="Garamond" w:hAnsi="Garamond"/>
           <w:color w:val="000000" w:themeColor="text1"/>
@@ -2822,7 +2975,7 @@
           <w:rFonts w:ascii="Garamond" w:hAnsi="Garamond"/>
           <w:color w:val="000000" w:themeColor="text1"/>
         </w:rPr>
-        <w:t>. Israeli Science Foundation (ISF). ₪561,000.</w:t>
+        <w:t>. Israel Science Foundation (ISF). ₪561,000.</w:t>
       </w:r>
     </w:p>
     <w:p>
@@ -2909,22 +3062,6 @@
     </w:p>
     <w:p>
       <w:pPr>
-        <w:pStyle w:val="Heading2"/>
-        <w:rPr>
-          <w:rFonts w:ascii="Garamond" w:hAnsi="Garamond"/>
-          <w:color w:val="000000" w:themeColor="text1"/>
-        </w:rPr>
-      </w:pPr>
-      <w:r>
-        <w:rPr>
-          <w:rFonts w:ascii="Garamond" w:hAnsi="Garamond"/>
-          <w:color w:val="000000" w:themeColor="text1"/>
-        </w:rPr>
-        <w:t>Pending</w:t>
-      </w:r>
-    </w:p>
-    <w:p>
-      <w:pPr>
         <w:spacing w:after="80"/>
         <w:rPr>
           <w:rFonts w:ascii="Garamond" w:hAnsi="Garamond"/>
@@ -2961,12 +3098,14 @@
           <w:rFonts w:ascii="Garamond" w:hAnsi="Garamond"/>
           <w:color w:val="000000" w:themeColor="text1"/>
         </w:rPr>
-        <w:t>. ISF.</w:t>
+        <w:t>. Israel Science Foundation (ISF). ₪540,000.</w:t>
       </w:r>
     </w:p>
     <w:p>
       <w:pPr>
         <w:pStyle w:val="Heading1"/>
+        <w:keepNext/>
+        <w:keepLines/>
         <w:rPr>
           <w:rFonts w:ascii="Garamond" w:hAnsi="Garamond"/>
           <w:color w:val="000000" w:themeColor="text1"/>
@@ -3164,15 +3303,8 @@
     <w:p>
       <w:pPr>
         <w:pStyle w:val="Heading1"/>
-        <w:rPr>
-          <w:rFonts w:ascii="Garamond" w:hAnsi="Garamond"/>
-          <w:color w:val="000000" w:themeColor="text1"/>
-        </w:rPr>
-      </w:pPr>
-    </w:p>
-    <w:p>
-      <w:pPr>
-        <w:pStyle w:val="Heading1"/>
+        <w:keepNext/>
+        <w:keepLines/>
         <w:rPr>
           <w:rFonts w:ascii="Garamond" w:hAnsi="Garamond"/>
           <w:color w:val="000000" w:themeColor="text1"/>
@@ -3190,6 +3322,8 @@
     <w:p>
       <w:pPr>
         <w:pStyle w:val="Heading2"/>
+        <w:keepNext/>
+        <w:keepLines/>
         <w:rPr>
           <w:rFonts w:ascii="Garamond" w:hAnsi="Garamond"/>
           <w:color w:val="000000" w:themeColor="text1"/>
@@ -3431,6 +3565,8 @@
     <w:p>
       <w:pPr>
         <w:pStyle w:val="Heading2"/>
+        <w:keepNext/>
+        <w:keepLines/>
         <w:rPr>
           <w:rFonts w:ascii="Garamond" w:hAnsi="Garamond"/>
           <w:color w:val="000000" w:themeColor="text1"/>
@@ -3872,6 +4008,8 @@
     <w:p>
       <w:pPr>
         <w:pStyle w:val="Heading2"/>
+        <w:keepNext/>
+        <w:keepLines/>
         <w:rPr>
           <w:rFonts w:ascii="Garamond" w:hAnsi="Garamond"/>
           <w:color w:val="000000" w:themeColor="text1"/>
@@ -4238,15 +4376,8 @@
     <w:p>
       <w:pPr>
         <w:pStyle w:val="Heading1"/>
-        <w:rPr>
-          <w:rFonts w:ascii="Garamond" w:hAnsi="Garamond"/>
-          <w:color w:val="000000" w:themeColor="text1"/>
-        </w:rPr>
-      </w:pPr>
-    </w:p>
-    <w:p>
-      <w:pPr>
-        <w:pStyle w:val="Heading1"/>
+        <w:keepNext/>
+        <w:keepLines/>
         <w:rPr>
           <w:rFonts w:ascii="Garamond" w:hAnsi="Garamond"/>
           <w:color w:val="000000" w:themeColor="text1"/>
@@ -4264,6 +4395,8 @@
     <w:p>
       <w:pPr>
         <w:pStyle w:val="Heading2"/>
+        <w:keepNext/>
+        <w:keepLines/>
         <w:rPr>
           <w:rFonts w:ascii="Garamond" w:hAnsi="Garamond"/>
           <w:color w:val="000000" w:themeColor="text1"/>
@@ -4405,6 +4538,8 @@
     <w:p>
       <w:pPr>
         <w:pStyle w:val="Heading2"/>
+        <w:keepNext/>
+        <w:keepLines/>
         <w:rPr>
           <w:rFonts w:ascii="Garamond" w:hAnsi="Garamond"/>
           <w:color w:val="000000" w:themeColor="text1"/>
@@ -4621,6 +4756,8 @@
     <w:p>
       <w:pPr>
         <w:pStyle w:val="Heading2"/>
+        <w:keepNext/>
+        <w:keepLines/>
         <w:rPr>
           <w:rFonts w:ascii="Garamond" w:hAnsi="Garamond"/>
           <w:color w:val="000000" w:themeColor="text1"/>
@@ -4987,6 +5124,8 @@
     <w:p>
       <w:pPr>
         <w:pStyle w:val="Heading1"/>
+        <w:keepNext/>
+        <w:keepLines/>
         <w:rPr>
           <w:rFonts w:ascii="Garamond" w:hAnsi="Garamond"/>
           <w:color w:val="000000" w:themeColor="text1"/>
@@ -5041,16 +5180,6 @@
         </w:rPr>
         <w:t>Matthew Edward Chippin, Post-Doctoral Fellow (co-supervised with Omer Kimchi): Comparative Distressed Financing Law</w:t>
       </w:r>
-    </w:p>
-    <w:p>
-      <w:pPr>
-        <w:spacing w:after="20"/>
-        <w:jc w:val="center"/>
-        <w:rPr>
-          <w:rFonts w:ascii="Garamond" w:hAnsi="Garamond"/>
-          <w:color w:val="000000" w:themeColor="text1"/>
-        </w:rPr>
-      </w:pPr>
     </w:p>
     <w:sectPr>
       <w:headerReference w:type="default" r:id="rId9"/>
@@ -5843,6 +5972,12 @@
     </w:lvlOverride>
   </w:num>
   <w:num w:numId="2" w16cid:durableId="1788113126">
+    <w:abstractNumId w:val="5"/>
+    <w:lvlOverride w:ilvl="0">
+      <w:startOverride w:val="1"/>
+    </w:lvlOverride>
+  </w:num>
+  <w:num w:numId="10" w16cid:durableId="1788113126">
     <w:abstractNumId w:val="5"/>
     <w:lvlOverride w:ilvl="0">
       <w:startOverride w:val="1"/>

</xml_diff>

<commit_message>
Remove post-doctoral fellow entry from CV graduate supervision
Drops the Matthew Edward Chippin co-supervision line; the Graduate
Supervision section retains the Yakove LLM thesis entry.

Co-Authored-By: Claude Opus 5 (1M context) <noreply@anthropic.com>
</commit_message>
<xml_diff>
--- a/Yifat Aran CV 2026 April 29.docx
+++ b/Yifat Aran CV 2026 April 29.docx
@@ -5158,27 +5158,6 @@
           <w:szCs w:val="20"/>
         </w:rPr>
         <w:t>Yasmin Yakove, LLM thesis: Startup Insolvency (2026, in progress)</w:t>
-      </w:r>
-    </w:p>
-    <w:p>
-      <w:pPr>
-        <w:spacing w:after="120"/>
-        <w:ind w:left="720"/>
-        <w:rPr>
-          <w:rFonts w:ascii="Garamond" w:hAnsi="Garamond"/>
-          <w:color w:val="000000" w:themeColor="text1"/>
-        </w:rPr>
-      </w:pPr>
-      <w:r>
-        <w:rPr>
-          <w:rFonts w:ascii="Garamond" w:hAnsi="Garamond"/>
-          <w:i/>
-          <w:iCs/>
-          <w:color w:val="000000" w:themeColor="text1"/>
-          <w:sz w:val="20"/>
-          <w:szCs w:val="20"/>
-        </w:rPr>
-        <w:t>Matthew Edward Chippin, Post-Doctoral Fellow (co-supervised with Omer Kimchi): Comparative Distressed Financing Law</w:t>
       </w:r>
     </w:p>
     <w:sectPr>

</xml_diff>